<commit_message>
Fix Insurance-format doc hyperlink colour and page break
Links now render in HLB link blue (#10538F) instead of default Word
blue, matching the original Insurance doc's styling. Also fixes a
stranded "9. Engagement Models" heading at a page bottom. No content
changes.
</commit_message>
<xml_diff>
--- a/content-pipeline/requirements/2026-09-28-power-bi-services-homepage/output/power-bi-services-homepage-insurance-format.docx
+++ b/content-pipeline/requirements/2026-09-28-power-bi-services-homepage/output/power-bi-services-homepage-insurance-format.docx
@@ -670,6 +670,7 @@
     <w:p>
       <w:pPr>
         <w:pStyle w:val="ListParagraph"/>
+        <w:keepNext/>
         <w:numPr>
           <w:ilvl w:val="0"/>
           <w:numId w:val="2"/>
@@ -695,6 +696,7 @@
     <w:p>
       <w:pPr>
         <w:pStyle w:val="ListParagraph"/>
+        <w:keepNext w:val="false"/>
         <w:numPr>
           <w:ilvl w:val="0"/>
           <w:numId w:val="2"/>
@@ -720,6 +722,7 @@
     <w:p>
       <w:pPr>
         <w:pStyle w:val="ListParagraph"/>
+        <w:keepNext w:val="false"/>
         <w:numPr>
           <w:ilvl w:val="0"/>
           <w:numId w:val="2"/>
@@ -745,6 +748,7 @@
     <w:p>
       <w:pPr>
         <w:pStyle w:val="ListParagraph"/>
+        <w:keepNext w:val="false"/>
         <w:numPr>
           <w:ilvl w:val="0"/>
           <w:numId w:val="2"/>
@@ -779,6 +783,7 @@
     <w:p>
       <w:pPr>
         <w:pStyle w:val="ListParagraph"/>
+        <w:keepNext w:val="false"/>
         <w:numPr>
           <w:ilvl w:val="0"/>
           <w:numId w:val="2"/>
@@ -804,6 +809,7 @@
     <w:p>
       <w:pPr>
         <w:pStyle w:val="ListParagraph"/>
+        <w:keepNext w:val="false"/>
         <w:numPr>
           <w:ilvl w:val="0"/>
           <w:numId w:val="2"/>
@@ -1117,6 +1123,7 @@
     <w:p>
       <w:pPr>
         <w:pStyle w:val="ListParagraph"/>
+        <w:keepNext w:val="false"/>
         <w:numPr>
           <w:ilvl w:val="0"/>
           <w:numId w:val="2"/>
@@ -1486,6 +1493,7 @@
     <w:p>
       <w:pPr>
         <w:pStyle w:val="ListParagraph"/>
+        <w:keepNext w:val="false"/>
         <w:numPr>
           <w:ilvl w:val="0"/>
           <w:numId w:val="2"/>
@@ -1518,6 +1526,7 @@
     <w:p>
       <w:pPr>
         <w:pStyle w:val="ListParagraph"/>
+        <w:keepNext w:val="false"/>
         <w:numPr>
           <w:ilvl w:val="0"/>
           <w:numId w:val="2"/>
@@ -1533,10 +1542,11 @@
         </w:rPr>
         <w:t xml:space="preserve">Button: </w:t>
       </w:r>
-      <w:hyperlink w:history="1" r:id="rId9ws6dlkkbjduzy0tsef4y">
+      <w:hyperlink w:history="1" r:id="rIdupe2hhn9jdhnyeyzweamn">
         <w:r>
           <w:rPr>
             <w:rStyle w:val="Hyperlink"/>
+            <w:color w:val="10538F"/>
           </w:rPr>
           <w:t xml:space="preserve">Read Microsoft's announcement</w:t>
         </w:r>
@@ -1560,6 +1570,7 @@
     <w:p>
       <w:pPr>
         <w:pStyle w:val="ListParagraph"/>
+        <w:keepNext/>
         <w:numPr>
           <w:ilvl w:val="0"/>
           <w:numId w:val="2"/>
@@ -1585,6 +1596,7 @@
     <w:p>
       <w:pPr>
         <w:pStyle w:val="ListParagraph"/>
+        <w:keepNext/>
         <w:numPr>
           <w:ilvl w:val="0"/>
           <w:numId w:val="2"/>
@@ -1610,6 +1622,7 @@
     <w:p>
       <w:pPr>
         <w:pStyle w:val="ListParagraph"/>
+        <w:keepNext w:val="false"/>
         <w:numPr>
           <w:ilvl w:val="0"/>
           <w:numId w:val="2"/>
@@ -1631,10 +1644,11 @@
         </w:rPr>
         <w:t xml:space="preserve">HLB HAMT is a Power BI consulting company that is also a licensed audit, tax and advisory firm, and a member of the HLB International network. Power BI gives us the platform; our accountants and engineers make the numbers reconcile. That combination anchors our </w:t>
       </w:r>
-      <w:hyperlink w:history="1" r:id="rIder4bj4mhhphiavff3cjg9">
+      <w:hyperlink w:history="1" r:id="rIdoi56ozmb3gnfrgix_i83m">
         <w:r>
           <w:rPr>
             <w:rStyle w:val="Hyperlink"/>
+            <w:color w:val="10538F"/>
           </w:rPr>
           <w:t xml:space="preserve">digital transformation and analytics services</w:t>
         </w:r>
@@ -1824,6 +1838,7 @@
     <w:p>
       <w:pPr>
         <w:pStyle w:val="ListParagraph"/>
+        <w:keepNext/>
         <w:numPr>
           <w:ilvl w:val="0"/>
           <w:numId w:val="2"/>
@@ -1849,6 +1864,7 @@
     <w:p>
       <w:pPr>
         <w:pStyle w:val="ListParagraph"/>
+        <w:keepNext/>
         <w:numPr>
           <w:ilvl w:val="0"/>
           <w:numId w:val="2"/>
@@ -1874,6 +1890,7 @@
     <w:p>
       <w:pPr>
         <w:pStyle w:val="ListParagraph"/>
+        <w:keepNext w:val="false"/>
         <w:numPr>
           <w:ilvl w:val="0"/>
           <w:numId w:val="2"/>
@@ -2544,6 +2561,7 @@
     <w:p>
       <w:pPr>
         <w:pStyle w:val="ListParagraph"/>
+        <w:keepNext w:val="false"/>
         <w:numPr>
           <w:ilvl w:val="0"/>
           <w:numId w:val="2"/>
@@ -2569,6 +2587,7 @@
     <w:p>
       <w:pPr>
         <w:pStyle w:val="ListParagraph"/>
+        <w:keepNext w:val="false"/>
         <w:numPr>
           <w:ilvl w:val="0"/>
           <w:numId w:val="2"/>
@@ -2603,6 +2622,7 @@
     <w:p>
       <w:pPr>
         <w:pStyle w:val="ListParagraph"/>
+        <w:keepNext/>
         <w:numPr>
           <w:ilvl w:val="0"/>
           <w:numId w:val="2"/>
@@ -2628,6 +2648,7 @@
     <w:p>
       <w:pPr>
         <w:pStyle w:val="ListParagraph"/>
+        <w:keepNext/>
         <w:numPr>
           <w:ilvl w:val="0"/>
           <w:numId w:val="2"/>
@@ -2653,6 +2674,7 @@
     <w:p>
       <w:pPr>
         <w:pStyle w:val="ListParagraph"/>
+        <w:keepNext w:val="false"/>
         <w:numPr>
           <w:ilvl w:val="0"/>
           <w:numId w:val="2"/>
@@ -2674,10 +2696,11 @@
         </w:rPr>
         <w:t xml:space="preserve">Our consultants begin with the KPIs a role or sector is judged on, then design the model, measures and page layout around those numbers. The same KPI-first thinking runs through our wider </w:t>
       </w:r>
-      <w:hyperlink w:history="1" r:id="rIdd_yrkdrpmpdd3tyaj9qmi">
+      <w:hyperlink w:history="1" r:id="rIdutkz9qo9d4fk_xhvovo3m">
         <w:r>
           <w:rPr>
             <w:rStyle w:val="Hyperlink"/>
+            <w:color w:val="10538F"/>
           </w:rPr>
           <w:t xml:space="preserve">data visualisation services</w:t>
         </w:r>
@@ -2855,10 +2878,11 @@
         </w:rPr>
         <w:t xml:space="preserve">We track taxable income, IAS 12 deferred tax, transfer pricing and VAT returns, with free zone and mainland results kept apart. With our </w:t>
       </w:r>
-      <w:hyperlink w:history="1" r:id="rIdushvo_ilf3pwp4iht8frf">
+      <w:hyperlink w:history="1" r:id="rIdevwey-uxmz5jrez2y5ulr">
         <w:r>
           <w:rPr>
             <w:rStyle w:val="Hyperlink"/>
+            <w:color w:val="10538F"/>
           </w:rPr>
           <w:t xml:space="preserve">UAE Corporate Tax advisory</w:t>
         </w:r>
@@ -3254,6 +3278,7 @@
     <w:p>
       <w:pPr>
         <w:pStyle w:val="ListParagraph"/>
+        <w:keepNext w:val="false"/>
         <w:numPr>
           <w:ilvl w:val="0"/>
           <w:numId w:val="2"/>
@@ -3288,6 +3313,7 @@
     <w:p>
       <w:pPr>
         <w:pStyle w:val="ListParagraph"/>
+        <w:keepNext/>
         <w:numPr>
           <w:ilvl w:val="0"/>
           <w:numId w:val="2"/>
@@ -3313,6 +3339,7 @@
     <w:p>
       <w:pPr>
         <w:pStyle w:val="ListParagraph"/>
+        <w:keepNext/>
         <w:numPr>
           <w:ilvl w:val="0"/>
           <w:numId w:val="2"/>
@@ -3338,6 +3365,7 @@
     <w:p>
       <w:pPr>
         <w:pStyle w:val="ListParagraph"/>
+        <w:keepNext w:val="false"/>
         <w:numPr>
           <w:ilvl w:val="0"/>
           <w:numId w:val="2"/>
@@ -3763,10 +3791,11 @@
               </w:rPr>
               <w:t xml:space="preserve">We work model-first, not visual-first: semantic models with consistent KPI definitions and tested DAX come ahead of the first chart. On that base we build executive dashboards and analyst reports with drill-through, cross-filtering, slicers and bookmarks, plus mobile layouts and Arabic right-to-left design. See </w:t>
             </w:r>
-            <w:hyperlink w:history="1" r:id="rIdulswydhzziirrfiliklkr">
+            <w:hyperlink w:history="1" r:id="rId2yx0vyxqyltfwp7xgdivo">
               <w:r>
                 <w:rPr>
                   <w:rStyle w:val="Hyperlink"/>
+                  <w:color w:val="10538F"/>
                   <w:sz w:val="18"/>
                   <w:szCs w:val="18"/>
                 </w:rPr>
@@ -4096,6 +4125,7 @@
     <w:p>
       <w:pPr>
         <w:pStyle w:val="ListParagraph"/>
+        <w:keepNext/>
         <w:numPr>
           <w:ilvl w:val="0"/>
           <w:numId w:val="2"/>
@@ -4121,6 +4151,7 @@
     <w:p>
       <w:pPr>
         <w:pStyle w:val="ListParagraph"/>
+        <w:keepNext w:val="false"/>
         <w:numPr>
           <w:ilvl w:val="0"/>
           <w:numId w:val="2"/>
@@ -4146,6 +4177,7 @@
     <w:p>
       <w:pPr>
         <w:pStyle w:val="ListParagraph"/>
+        <w:keepNext w:val="false"/>
         <w:numPr>
           <w:ilvl w:val="0"/>
           <w:numId w:val="2"/>
@@ -4180,6 +4212,7 @@
     <w:p>
       <w:pPr>
         <w:pStyle w:val="ListParagraph"/>
+        <w:keepNext/>
         <w:numPr>
           <w:ilvl w:val="0"/>
           <w:numId w:val="2"/>
@@ -4205,6 +4238,7 @@
     <w:p>
       <w:pPr>
         <w:pStyle w:val="ListParagraph"/>
+        <w:keepNext/>
         <w:numPr>
           <w:ilvl w:val="0"/>
           <w:numId w:val="2"/>
@@ -4237,6 +4271,7 @@
     <w:p>
       <w:pPr>
         <w:pStyle w:val="ListParagraph"/>
+        <w:keepNext w:val="false"/>
         <w:numPr>
           <w:ilvl w:val="0"/>
           <w:numId w:val="2"/>
@@ -4450,6 +4485,7 @@
     <w:p>
       <w:pPr>
         <w:pStyle w:val="ListParagraph"/>
+        <w:keepNext w:val="false"/>
         <w:numPr>
           <w:ilvl w:val="0"/>
           <w:numId w:val="2"/>
@@ -4484,6 +4520,7 @@
     <w:p>
       <w:pPr>
         <w:pStyle w:val="ListParagraph"/>
+        <w:keepNext/>
         <w:numPr>
           <w:ilvl w:val="0"/>
           <w:numId w:val="2"/>
@@ -4509,6 +4546,7 @@
     <w:p>
       <w:pPr>
         <w:pStyle w:val="ListParagraph"/>
+        <w:keepNext/>
         <w:numPr>
           <w:ilvl w:val="0"/>
           <w:numId w:val="2"/>
@@ -4534,6 +4572,7 @@
     <w:p>
       <w:pPr>
         <w:pStyle w:val="ListParagraph"/>
+        <w:keepNext w:val="false"/>
         <w:numPr>
           <w:ilvl w:val="0"/>
           <w:numId w:val="2"/>
@@ -5138,6 +5177,7 @@
     <w:p>
       <w:pPr>
         <w:pStyle w:val="ListParagraph"/>
+        <w:keepNext/>
         <w:numPr>
           <w:ilvl w:val="0"/>
           <w:numId w:val="2"/>
@@ -5163,6 +5203,7 @@
     <w:p>
       <w:pPr>
         <w:pStyle w:val="ListParagraph"/>
+        <w:keepNext/>
         <w:numPr>
           <w:ilvl w:val="0"/>
           <w:numId w:val="2"/>
@@ -5188,6 +5229,7 @@
     <w:p>
       <w:pPr>
         <w:pStyle w:val="ListParagraph"/>
+        <w:keepNext w:val="false"/>
         <w:numPr>
           <w:ilvl w:val="0"/>
           <w:numId w:val="2"/>
@@ -5362,10 +5404,11 @@
         </w:rPr>
         <w:t xml:space="preserve">Booked revenue in Power BI, open-deal scoring in </w:t>
       </w:r>
-      <w:hyperlink w:history="1" r:id="rIdnebyi2snmsu8sjzc0i5k-">
+      <w:hyperlink w:history="1" r:id="rId3wlw27v7jy0lhz6nvcxbk">
         <w:r>
           <w:rPr>
             <w:rStyle w:val="Hyperlink"/>
+            <w:color w:val="10538F"/>
           </w:rPr>
           <w:t xml:space="preserve">SugarAI CRM</w:t>
         </w:r>
@@ -5466,6 +5509,7 @@
     <w:p>
       <w:pPr>
         <w:pStyle w:val="ListParagraph"/>
+        <w:keepNext/>
         <w:numPr>
           <w:ilvl w:val="0"/>
           <w:numId w:val="2"/>
@@ -5491,6 +5535,7 @@
     <w:p>
       <w:pPr>
         <w:pStyle w:val="ListParagraph"/>
+        <w:keepNext/>
         <w:numPr>
           <w:ilvl w:val="0"/>
           <w:numId w:val="2"/>
@@ -5516,6 +5561,7 @@
     <w:p>
       <w:pPr>
         <w:pStyle w:val="ListParagraph"/>
+        <w:keepNext w:val="false"/>
         <w:numPr>
           <w:ilvl w:val="0"/>
           <w:numId w:val="2"/>
@@ -5541,6 +5587,7 @@
     <w:p>
       <w:pPr>
         <w:pStyle w:val="ListParagraph"/>
+        <w:keepNext w:val="false"/>
         <w:numPr>
           <w:ilvl w:val="0"/>
           <w:numId w:val="2"/>
@@ -5566,6 +5613,7 @@
     <w:p>
       <w:pPr>
         <w:pStyle w:val="ListParagraph"/>
+        <w:keepNext w:val="false"/>
         <w:numPr>
           <w:ilvl w:val="0"/>
           <w:numId w:val="2"/>
@@ -5600,6 +5648,7 @@
     <w:p>
       <w:pPr>
         <w:pStyle w:val="ListParagraph"/>
+        <w:keepNext/>
         <w:numPr>
           <w:ilvl w:val="0"/>
           <w:numId w:val="2"/>
@@ -5625,6 +5674,7 @@
     <w:p>
       <w:pPr>
         <w:pStyle w:val="ListParagraph"/>
+        <w:keepNext w:val="false"/>
         <w:numPr>
           <w:ilvl w:val="0"/>
           <w:numId w:val="2"/>
@@ -5650,6 +5700,7 @@
     <w:p>
       <w:pPr>
         <w:pStyle w:val="ListParagraph"/>
+        <w:keepNext w:val="false"/>
         <w:numPr>
           <w:ilvl w:val="0"/>
           <w:numId w:val="2"/>
@@ -5684,6 +5735,7 @@
     <w:p>
       <w:pPr>
         <w:pStyle w:val="ListParagraph"/>
+        <w:keepNext/>
         <w:numPr>
           <w:ilvl w:val="0"/>
           <w:numId w:val="2"/>
@@ -5709,6 +5761,7 @@
     <w:p>
       <w:pPr>
         <w:pStyle w:val="ListParagraph"/>
+        <w:keepNext/>
         <w:numPr>
           <w:ilvl w:val="0"/>
           <w:numId w:val="2"/>
@@ -5918,10 +5971,11 @@
         </w:rPr>
         <w:t xml:space="preserve">Yes. It is often the first thing clients ask us to fix. Rather than a team member copying figures between workbooks every week, data refreshes on a schedule and dashboards stay current. Through </w:t>
       </w:r>
-      <w:hyperlink w:history="1" r:id="rId2ls2q9hayq2i_bclsrib5">
+      <w:hyperlink w:history="1" r:id="rId_4zozv4nhljfevscvdbv6">
         <w:r>
           <w:rPr>
             <w:rStyle w:val="Hyperlink"/>
+            <w:color w:val="10538F"/>
           </w:rPr>
           <w:t xml:space="preserve">Power BI automation</w:t>
         </w:r>
@@ -6026,10 +6080,11 @@
         </w:rPr>
         <w:t xml:space="preserve">, and our </w:t>
       </w:r>
-      <w:hyperlink w:history="1" r:id="rIdxuc7ifln243vre2tzavh_">
+      <w:hyperlink w:history="1" r:id="rId6ci7p4tnfnutcg5ap6p5r">
         <w:r>
           <w:rPr>
             <w:rStyle w:val="Hyperlink"/>
+            <w:color w:val="10538F"/>
           </w:rPr>
           <w:t xml:space="preserve">data protection advisory</w:t>
         </w:r>
@@ -6209,10 +6264,11 @@
         </w:numPr>
         <w:spacing w:after="20"/>
       </w:pPr>
-      <w:hyperlink w:history="1" r:id="rId0pdotrt0rn-3octhhv8eo">
+      <w:hyperlink w:history="1" r:id="rIdalvfou7kuqwarmz6mlfvy">
         <w:r>
           <w:rPr>
             <w:rStyle w:val="Hyperlink"/>
+            <w:color w:val="10538F"/>
             <w:sz w:val="17"/>
             <w:szCs w:val="17"/>
           </w:rPr>
@@ -6237,10 +6293,11 @@
         </w:numPr>
         <w:spacing w:after="20"/>
       </w:pPr>
-      <w:hyperlink w:history="1" r:id="rIdb_mdfie1m8jozh8eztvcf">
+      <w:hyperlink w:history="1" r:id="rIdmgrzcbtdmngsobcsbj2u-">
         <w:r>
           <w:rPr>
             <w:rStyle w:val="Hyperlink"/>
+            <w:color w:val="10538F"/>
             <w:sz w:val="17"/>
             <w:szCs w:val="17"/>
           </w:rPr>
@@ -6265,10 +6322,11 @@
         </w:numPr>
         <w:spacing w:after="20"/>
       </w:pPr>
-      <w:hyperlink w:history="1" r:id="rIdtxiue5747o7fzsugzt1fi">
+      <w:hyperlink w:history="1" r:id="rIdpaj7gkvcn2rkv0f3be72v">
         <w:r>
           <w:rPr>
             <w:rStyle w:val="Hyperlink"/>
+            <w:color w:val="10538F"/>
             <w:sz w:val="17"/>
             <w:szCs w:val="17"/>
           </w:rPr>
@@ -6283,10 +6341,11 @@
         </w:rPr>
         <w:t xml:space="preserve">; also </w:t>
       </w:r>
-      <w:hyperlink w:history="1" r:id="rIdkxw3ctr4rdglporizvjbu">
+      <w:hyperlink w:history="1" r:id="rIdm9alndkxgkgpog7swuwdw">
         <w:r>
           <w:rPr>
             <w:rStyle w:val="Hyperlink"/>
+            <w:color w:val="10538F"/>
             <w:sz w:val="17"/>
             <w:szCs w:val="17"/>
           </w:rPr>
@@ -6311,10 +6370,11 @@
         </w:numPr>
         <w:spacing w:after="20"/>
       </w:pPr>
-      <w:hyperlink w:history="1" r:id="rIdh4q83nrxmw-ksgxfg9qlm">
+      <w:hyperlink w:history="1" r:id="rIdc4ou66bpaqc21yauzkf7j">
         <w:r>
           <w:rPr>
             <w:rStyle w:val="Hyperlink"/>
+            <w:color w:val="10538F"/>
             <w:sz w:val="17"/>
             <w:szCs w:val="17"/>
           </w:rPr>
@@ -6329,10 +6389,11 @@
         </w:rPr>
         <w:t xml:space="preserve">; </w:t>
       </w:r>
-      <w:hyperlink w:history="1" r:id="rId2l-6ynmsulwd3s-gkjrjl">
+      <w:hyperlink w:history="1" r:id="rIdfluszcrh11cdurfc9fxuf">
         <w:r>
           <w:rPr>
             <w:rStyle w:val="Hyperlink"/>
+            <w:color w:val="10538F"/>
             <w:sz w:val="17"/>
             <w:szCs w:val="17"/>
           </w:rPr>
@@ -6373,10 +6434,11 @@
         </w:numPr>
         <w:spacing w:after="20"/>
       </w:pPr>
-      <w:hyperlink w:history="1" r:id="rIdcwphjlacrphfem7eqytnm">
+      <w:hyperlink w:history="1" r:id="rIdnz7cz_aiasaoiptq_zriq">
         <w:r>
           <w:rPr>
             <w:rStyle w:val="Hyperlink"/>
+            <w:color w:val="10538F"/>
             <w:sz w:val="17"/>
             <w:szCs w:val="17"/>
           </w:rPr>
@@ -6401,10 +6463,11 @@
         </w:numPr>
         <w:spacing w:after="20"/>
       </w:pPr>
-      <w:hyperlink w:history="1" r:id="rIdhp5qsokclxkexkfshgt95">
+      <w:hyperlink w:history="1" r:id="rIdii6g8dqqrpq0qgwdknjzl">
         <w:r>
           <w:rPr>
             <w:rStyle w:val="Hyperlink"/>
+            <w:color w:val="10538F"/>
             <w:sz w:val="17"/>
             <w:szCs w:val="17"/>
           </w:rPr>
@@ -6437,10 +6500,11 @@
         </w:rPr>
         <w:t xml:space="preserve">Microsoft Power BI </w:t>
       </w:r>
-      <w:hyperlink w:history="1" r:id="rIddxwpqkcxymktqaca8eca_">
+      <w:hyperlink w:history="1" r:id="rIdebeubrqdhkgqf9unmzleg">
         <w:r>
           <w:rPr>
             <w:rStyle w:val="Hyperlink"/>
+            <w:color w:val="10538F"/>
             <w:sz w:val="17"/>
             <w:szCs w:val="17"/>
           </w:rPr>
@@ -6455,10 +6519,11 @@
         </w:rPr>
         <w:t xml:space="preserve"> and </w:t>
       </w:r>
-      <w:hyperlink w:history="1" r:id="rIdq3qr9jpttiv__cdbja8fn">
+      <w:hyperlink w:history="1" r:id="rIdmobsluw9uzjj2yesg6le3">
         <w:r>
           <w:rPr>
             <w:rStyle w:val="Hyperlink"/>
+            <w:color w:val="10538F"/>
             <w:sz w:val="17"/>
             <w:szCs w:val="17"/>
           </w:rPr>
@@ -6491,10 +6556,11 @@
         </w:rPr>
         <w:t xml:space="preserve">Microsoft Learn, </w:t>
       </w:r>
-      <w:hyperlink w:history="1" r:id="rIdjiohsvlywpcsv9pu8bkvg">
+      <w:hyperlink w:history="1" r:id="rIdwdzcomj4j8rcuuifvhvl9">
         <w:r>
           <w:rPr>
             <w:rStyle w:val="Hyperlink"/>
+            <w:color w:val="10538F"/>
             <w:sz w:val="17"/>
             <w:szCs w:val="17"/>
           </w:rPr>
@@ -6509,10 +6575,11 @@
         </w:rPr>
         <w:t xml:space="preserve"> and </w:t>
       </w:r>
-      <w:hyperlink w:history="1" r:id="rIdfcchz4opbv_f8ji17sg7n">
+      <w:hyperlink w:history="1" r:id="rIdpbjbjyvwcns1m87lojoet">
         <w:r>
           <w:rPr>
             <w:rStyle w:val="Hyperlink"/>
+            <w:color w:val="10538F"/>
             <w:sz w:val="17"/>
             <w:szCs w:val="17"/>
           </w:rPr>
@@ -6537,10 +6604,11 @@
         </w:numPr>
         <w:spacing w:after="20"/>
       </w:pPr>
-      <w:hyperlink w:history="1" r:id="rIdjnh24qdtaazticxjulmqg">
+      <w:hyperlink w:history="1" r:id="rIdfvz9u8biwpep-mwyxhazr">
         <w:r>
           <w:rPr>
             <w:rStyle w:val="Hyperlink"/>
+            <w:color w:val="10538F"/>
             <w:sz w:val="17"/>
             <w:szCs w:val="17"/>
           </w:rPr>
@@ -6568,6 +6636,7 @@
     <w:p>
       <w:pPr>
         <w:pStyle w:val="ListParagraph"/>
+        <w:keepNext/>
         <w:numPr>
           <w:ilvl w:val="0"/>
           <w:numId w:val="2"/>
@@ -6593,6 +6662,7 @@
     <w:p>
       <w:pPr>
         <w:pStyle w:val="ListParagraph"/>
+        <w:keepNext w:val="false"/>
         <w:numPr>
           <w:ilvl w:val="0"/>
           <w:numId w:val="2"/>
@@ -6618,6 +6688,7 @@
     <w:p>
       <w:pPr>
         <w:pStyle w:val="ListParagraph"/>
+        <w:keepNext w:val="false"/>
         <w:numPr>
           <w:ilvl w:val="0"/>
           <w:numId w:val="2"/>
@@ -6643,6 +6714,7 @@
     <w:p>
       <w:pPr>
         <w:pStyle w:val="ListParagraph"/>
+        <w:keepNext w:val="false"/>
         <w:numPr>
           <w:ilvl w:val="0"/>
           <w:numId w:val="2"/>
@@ -6677,6 +6749,7 @@
     <w:p>
       <w:pPr>
         <w:pStyle w:val="ListParagraph"/>
+        <w:keepNext w:val="false"/>
         <w:numPr>
           <w:ilvl w:val="0"/>
           <w:numId w:val="2"/>

</xml_diff>